<commit_message>
feat: show a Word document's comments, tracked changes and photos
Word keeps who commented, who changed what, and the text a tracked
deletion removed, which no page shows but anyone can bring back. Each
photo placed in an Office document is read for its own location and
camera. The clean copy strips the photos' EXIF too; comments and
tracked changes are text, so they stay and the page says how to remove
them in Word. The sample document now carries a comment and a tracked
deletion.
</commit_message>
<xml_diff>
--- a/apps/web/public/samples/report.docx
+++ b/apps/web/public/samples/report.docx
@@ -6,6 +6,7 @@
       <w:pPr>
         <w:spacing w:after="321"/>
       </w:pPr>
+      <w:commentRangeStart w:id="0"/>
       <w:r>
         <w:rPr>
           <w:rFonts w:ascii="Times" w:hAnsi="Times" w:cs="Times"/>
@@ -16,6 +17,10 @@
         </w:rPr>
         <w:t xml:space="preserve">Quarterly report</w:t>
       </w:r>
+      <w:commentRangeEnd w:id="0"/>
+      <w:r>
+        <w:commentReference w:id="0"/>
+      </w:r>
     </w:p>
     <w:p>
       <w:pPr>
@@ -28,12 +33,32 @@
           <w:sz-cs w:val="24"/>
           <w:spacing w:val="0"/>
         </w:rPr>
-        <w:t xml:space="preserve">Sales grew in every region this quarter. Sales grew in every region this quarter, and the photo from the launch event is attached below.</w:t>
+        <w:t xml:space="preserve">Sales grew in every region this quarter</w:t>
+      </w:r>
+      <w:del w:id="1" w:author="Petro Ivanenko" w:date="2025-11-03T10:02:00Z">
+        <w:r>
+          <w:delText xml:space="preserve">, except the east, where we lost the Lviv contract</w:delText>
+        </w:r>
+      </w:del>
+      <w:r>
+        <w:t xml:space="preserve">. Sales grew in every region this quarter, and the photo from the launch event is attached below.</w:t>
       </w:r>
     </w:p>
     <w:sectPr/>
   </w:body>
 </w:document>
+</file>
+
+<file path=word/comments.xml><?xml version="1.0" encoding="utf-8"?>
+<w:comments xmlns:w="http://schemas.openxmlformats.org/wordprocessingml/2006/main">
+  <w:comment w:id="0" w:author="Olena Koval" w:date="2025-11-03T09:40:00Z" w:initials="OK">
+    <w:p>
+      <w:r>
+        <w:t>Numbers are still the old ones: do not send this to the client yet.</w:t>
+      </w:r>
+    </w:p>
+  </w:comment>
+</w:comments>
 </file>
 
 <file path=word/theme/theme1.xml><?xml version="1.0" encoding="utf-8"?>

</xml_diff>